<commit_message>
Add 20260831 LASSO outputs (6 models) and annotated MS/SM/Mod docs
Co-authored-by: dreamcheap2000 <229635625+dreamcheap2000@users.noreply.github.com>
</commit_message>
<xml_diff>
--- a/20260831_MS_0802.docx
+++ b/20260831_MS_0802.docx
@@ -9,12 +9,12 @@
           <w:color w:val="C00000"/>
           <w:sz w:val="22"/>
         </w:rPr>
-        <w:t>ANNOTATED MANUSCRIPT – Issues highlighted in YELLOW, suggestions in BLUE</w:t>
+        <w:t>ANNOTATED MANUSCRIPT (20260831_MS_0802) – Yellow = needs change; Blue = suggestion</w:t>
       </w:r>
     </w:p>
     <w:p>
       <w:r>
-        <w:t>Date: 2026-08-31  |  New Model 3 (CPANM-NGS) added; Models 3→4, 4→5, 5→6 renumbered</w:t>
+        <w:t>Actual 20260831 LASSO results: Model 1 CV R²=0.4906 | Model 2 (CPANM-GS) CV R²=0.5154 | Model 3 (CPANM-NGS) CV R²=0.5041 | Model 6 (old Model 2, poor) CV R²=0.2442</w:t>
       </w:r>
     </w:p>
     <w:p/>
@@ -94,7 +94,6 @@
       </w:r>
     </w:p>
     <w:p>
-      <w:pPr/>
       <w:r>
         <w:rPr>
           <w:highlight w:val="yellow"/>
@@ -109,11 +108,10 @@
           <w:color w:val="0070C0"/>
           <w:sz w:val="18"/>
         </w:rPr>
-        <w:t>[ANNOTATION: Methods sentence: PANM→CPANM; add Model 3 (CPANM-NGS); shift models 3→4, 4→5, 5→6. NOTE: 'PANM' used here but body text uses 'CPANM' — standardize.]</w:t>
+        <w:t>⚑ Methods sentence — ISSUE: 'PANM' should be 'CPANM'. New Model 3 (CPANM-NGS) needed. Models 3→4→5→6. SUGGESTION: '…Model 2 (CPANM-GS, N=511); Model 3 (CPANM-NGS, N=511); Model 4 (ERPM, N=271); Model 5 (RBE, N=511); Model 6 (NARC, N=633).'</w:t>
       </w:r>
     </w:p>
     <w:p>
-      <w:pPr/>
       <w:r>
         <w:rPr>
           <w:highlight w:val="yellow"/>
@@ -128,7 +126,7 @@
           <w:color w:val="0070C0"/>
           <w:sz w:val="18"/>
         </w:rPr>
-        <w:t>[ANNOTATION: Results: Insert new Model 2 (CPANM-GS) and Model 3 (CPANM-NGS) R² values. Renumber: Model 3→Model 4 (ERPM), Model 4→Model 5 (RBE), Model 5→Model 6 (NARC).]</w:t>
+        <w:t>⚑ Results — ISSUE: R² values and model numbers need updating. SUGGESTION: 'Model 1 (FAM, R²=0.4906); Model 2 (CPANM-GS, R²=0.5154); Model 3 (CPANM-NGS, R²=0.5041; ΔR²=+0.011 from gait speed); Model 4 (ERPM, R²=0.4931); Model 5 (RBE, 48.36%); Model 6 (NARC, AUC=0.8986).'</w:t>
       </w:r>
     </w:p>
     <w:p>
@@ -167,7 +165,6 @@
       </w:r>
     </w:p>
     <w:p>
-      <w:pPr/>
       <w:r>
         <w:rPr>
           <w:highlight w:val="yellow"/>
@@ -194,7 +191,7 @@
           <w:color w:val="0070C0"/>
           <w:sz w:val="18"/>
         </w:rPr>
-        <w:t>[ANNOTATION: Abbreviations: Add CPANM-GS (Model 2) and CPANM-NGS (Model 3). Update ERPM (now Model 4), remove old Model 3 reference. Standardize FAM/FcFAM/CAM to a single abbreviation.]</w:t>
+        <w:t>⚑ Abbreviations — ISSUE: Add CPANM-GS (Model 2), CPANM-NGS (Model 3). Update ERPM→Model 4, RBE→Model 5, NARC→Model 6. Remove FcFAM/CAM duplicate terms.</w:t>
       </w:r>
     </w:p>
     <w:p>
@@ -320,7 +317,6 @@
       </w:r>
     </w:p>
     <w:p>
-      <w:pPr/>
       <w:r>
         <w:rPr>
           <w:highlight w:val="yellow"/>
@@ -345,7 +341,7 @@
           <w:color w:val="0070C0"/>
           <w:sz w:val="18"/>
         </w:rPr>
-        <w:t>[ANNOTATION: Statistical Analysis: Model 2 description is correct for CPANM-GS. ADD new Model 3 (CPANM-NGS) entry. Renumber items 3→4 (ERPM), 4→5 (RBE), 5→6 (NARC).]</w:t>
+        <w:t>⚑ Statistical Analysis — ISSUE: Add new Model 3 (CPANM-NGS) item. Renumber ERPM→4, RBE→5, NARC→6. SUGGESTION: '3. Model 3 CPANM-NGS (N=511): Identical to Model 2 except Gait_Speed_1_Imputed excluded (CV R²=0.5041).'</w:t>
       </w:r>
     </w:p>
     <w:p>
@@ -403,7 +399,6 @@
       </w:r>
     </w:p>
     <w:p>
-      <w:pPr/>
       <w:r>
         <w:rPr>
           <w:highlight w:val="yellow"/>
@@ -418,7 +413,7 @@
           <w:color w:val="0070C0"/>
           <w:sz w:val="18"/>
         </w:rPr>
-        <w:t>[ANNOTATION: Results – Predictive Modeling: Insert CPANM-NGS (Model 3) results. Rename ERPM references from 'Model 3' to 'Model 4'.]</w:t>
+        <w:t>⚑ Results/Predictive Modeling — ISSUE: Insert CPANM-GS (R²=0.5154) and CPANM-NGS (R²=0.5041) results. Rename ERPM from 'Model 3' to 'Model 4'. Add gait speed incremental contribution statement (ΔR²=+0.011, ΔMAE=0.90 m).</w:t>
       </w:r>
     </w:p>
     <w:p>
@@ -519,7 +514,6 @@
       </w:r>
     </w:p>
     <w:p>
-      <w:pPr/>
       <w:r>
         <w:rPr>
           <w:highlight w:val="yellow"/>
@@ -534,7 +528,7 @@
           <w:color w:val="0070C0"/>
           <w:sz w:val="18"/>
         </w:rPr>
-        <w:t>[ANNOTATION: Conclusions: Update number of models (five→six if stated explicitly). Optionally add sentence on gait speed imputation comparison.]</w:t>
+        <w:t>⚑ Conclusions — ISSUE: Update model count (five→six). ADD: 'Imputed gait speed contributed a modest ΔR²=+0.011 to the comprehensive neurological model, supporting the CPANM-NGS for settings without formal gait speed infrastructure.'</w:t>
       </w:r>
     </w:p>
     <w:p>
@@ -644,7 +638,6 @@
       </w:r>
     </w:p>
     <w:p>
-      <w:pPr/>
       <w:r>
         <w:rPr>
           <w:highlight w:val="yellow"/>
@@ -661,7 +654,7 @@
           <w:color w:val="0070C0"/>
           <w:sz w:val="18"/>
         </w:rPr>
-        <w:t>[ANNOTATION: Table 1 abbreviations: Add CPANM-NGS. Update ERPM→Model 4, RBE→Model 5, NARC→Model 6.]</w:t>
+        <w:t>⚑ Table 1 abbreviations — ISSUE: Add CPANM-NGS. Update ERPM→Model 4, RBE→Model 5, NARC→Model 6. Add Model 3 row with CV R²=0.5041.</w:t>
       </w:r>
     </w:p>
     <w:p/>

</xml_diff>